<commit_message>
Review fixes: clearer rules, 4th example, layout examples, friendlier errors (v3)
</commit_message>
<xml_diff>
--- a/Incident_Classification_problem.docx
+++ b/Incident_Classification_problem.docx
@@ -62,19 +62,6 @@
           <w:szCs w:val="22"/>
         </w:rPr>
         <w:t xml:space="preserve">The safety office of a (fictional) Chemical Engineering building keeps a log of every incident in its teaching labs and pilot plant. Before the monthly safety meeting, each report has to be sorted by what kind of incident it was (Type) and how serious it was (Severity), using the building's classification rules below.</w:t>
-      </w:r>
-    </w:p>
-    <w:p>
-      <w:pPr>
-        <w:spacing w:after="120"/>
-      </w:pPr>
-      <w:r>
-        <w:rPr>
-          <w:rFonts w:ascii="Bai Jamjuree" w:cs="Bai Jamjuree" w:eastAsia="Bai Jamjuree" w:hAnsi="Bai Jamjuree"/>
-          <w:sz w:val="22"/>
-          <w:szCs w:val="22"/>
-        </w:rPr>
-        <w:t xml:space="preserve">Each line of incident_reports.txt is one incident report from the fictional Chemical Engineering building (teaching labs and a pilot plant). Classify every report by Type and Severity.</w:t>
       </w:r>
     </w:p>
     <w:p>
@@ -482,7 +469,7 @@
                 <w:sz w:val="20"/>
                 <w:szCs w:val="20"/>
               </w:rPr>
-              <w:t xml:space="preserve">material escaped from where it should be: spills, leaks, drips, weeps, vapour or gas releases (including a gas-detector alarm caused by a leak), steam or compressed air escaping, or liquid poured into the wrong drain. Vapour given off during normal handling (weighing or pouring on the bench) is not a release.</w:t>
+              <w:t xml:space="preserve">material escaped from where it should be: spills, leaks, drips, weeps, vapour or gas releases (including a gas-detector alarm caused by a leak), steam or compressed air escaping, or liquid poured into the wrong drain. Vapour given off during normal handling (weighing or pouring on the bench) is not a release. Gas or vapour that burns as it comes out (a flame at a leak or at the neck of a flask) counts only as Fire, not also as a release.</w:t>
             </w:r>
           </w:p>
         </w:tc>
@@ -1251,7 +1238,7 @@
           <w:sz w:val="28"/>
           <w:szCs w:val="28"/>
         </w:rPr>
-        <w:t xml:space="preserve">Three worked examples (not in the 300 reports)</w:t>
+        <w:t xml:space="preserve">Four worked examples (not in the 300 reports)</w:t>
       </w:r>
     </w:p>
     <w:tbl>
@@ -1776,6 +1763,131 @@
           </w:p>
         </w:tc>
       </w:tr>
+      <w:tr>
+        <w:trPr>
+          <w:tblHeader w:val="false"/>
+        </w:trPr>
+        <w:tc>
+          <w:tcPr>
+            <w:tcW w:type="dxa" w:w="4300"/>
+            <w:tcBorders>
+              <w:top w:val="single" w:color="C9CFD6" w:sz="4"/>
+              <w:left w:val="single" w:color="C9CFD6" w:sz="4"/>
+              <w:bottom w:val="single" w:color="C9CFD6" w:sz="4"/>
+              <w:right w:val="single" w:color="C9CFD6" w:sz="4"/>
+            </w:tcBorders>
+            <w:tcMar>
+              <w:top w:type="dxa" w:w="50"/>
+              <w:left w:type="dxa" w:w="90"/>
+              <w:bottom w:type="dxa" w:w="50"/>
+              <w:right w:type="dxa" w:w="90"/>
+            </w:tcMar>
+          </w:tcPr>
+          <w:p>
+            <w:r>
+              <w:rPr>
+                <w:rFonts w:ascii="Bai Jamjuree" w:cs="Bai Jamjuree" w:eastAsia="Bai Jamjuree" w:hAnsi="Bai Jamjuree"/>
+                <w:b/>
+                <w:bCs/>
+                <w:color w:val="000000"/>
+                <w:sz w:val="20"/>
+                <w:szCs w:val="20"/>
+              </w:rPr>
+              <w:t xml:space="preserve">Student slipped while carrying a 2 L bottle of methanol; the bottle broke on the floor; bruised knee treated with a cold pack.</w:t>
+            </w:r>
+          </w:p>
+        </w:tc>
+        <w:tc>
+          <w:tcPr>
+            <w:tcW w:type="dxa" w:w="1200"/>
+            <w:tcBorders>
+              <w:top w:val="single" w:color="C9CFD6" w:sz="4"/>
+              <w:left w:val="single" w:color="C9CFD6" w:sz="4"/>
+              <w:bottom w:val="single" w:color="C9CFD6" w:sz="4"/>
+              <w:right w:val="single" w:color="C9CFD6" w:sz="4"/>
+            </w:tcBorders>
+            <w:tcMar>
+              <w:top w:type="dxa" w:w="50"/>
+              <w:left w:type="dxa" w:w="90"/>
+              <w:bottom w:type="dxa" w:w="50"/>
+              <w:right w:type="dxa" w:w="90"/>
+            </w:tcMar>
+          </w:tcPr>
+          <w:p>
+            <w:r>
+              <w:rPr>
+                <w:rFonts w:ascii="Bai Jamjuree" w:cs="Bai Jamjuree" w:eastAsia="Bai Jamjuree" w:hAnsi="Bai Jamjuree"/>
+                <w:b w:val="false"/>
+                <w:bCs w:val="false"/>
+                <w:color w:val="000000"/>
+                <w:sz w:val="20"/>
+                <w:szCs w:val="20"/>
+              </w:rPr>
+              <w:t xml:space="preserve">Injury</w:t>
+            </w:r>
+          </w:p>
+        </w:tc>
+        <w:tc>
+          <w:tcPr>
+            <w:tcW w:type="dxa" w:w="1200"/>
+            <w:tcBorders>
+              <w:top w:val="single" w:color="C9CFD6" w:sz="4"/>
+              <w:left w:val="single" w:color="C9CFD6" w:sz="4"/>
+              <w:bottom w:val="single" w:color="C9CFD6" w:sz="4"/>
+              <w:right w:val="single" w:color="C9CFD6" w:sz="4"/>
+            </w:tcBorders>
+            <w:tcMar>
+              <w:top w:type="dxa" w:w="50"/>
+              <w:left w:type="dxa" w:w="90"/>
+              <w:bottom w:type="dxa" w:w="50"/>
+              <w:right w:type="dxa" w:w="90"/>
+            </w:tcMar>
+          </w:tcPr>
+          <w:p>
+            <w:r>
+              <w:rPr>
+                <w:rFonts w:ascii="Bai Jamjuree" w:cs="Bai Jamjuree" w:eastAsia="Bai Jamjuree" w:hAnsi="Bai Jamjuree"/>
+                <w:b w:val="false"/>
+                <w:bCs w:val="false"/>
+                <w:color w:val="000000"/>
+                <w:sz w:val="20"/>
+                <w:szCs w:val="20"/>
+              </w:rPr>
+              <w:t xml:space="preserve">High</w:t>
+            </w:r>
+          </w:p>
+        </w:tc>
+        <w:tc>
+          <w:tcPr>
+            <w:tcW w:type="dxa" w:w="2600"/>
+            <w:tcBorders>
+              <w:top w:val="single" w:color="C9CFD6" w:sz="4"/>
+              <w:left w:val="single" w:color="C9CFD6" w:sz="4"/>
+              <w:bottom w:val="single" w:color="C9CFD6" w:sz="4"/>
+              <w:right w:val="single" w:color="C9CFD6" w:sz="4"/>
+            </w:tcBorders>
+            <w:tcMar>
+              <w:top w:type="dxa" w:w="50"/>
+              <w:left w:type="dxa" w:w="90"/>
+              <w:bottom w:type="dxa" w:w="50"/>
+              <w:right w:type="dxa" w:w="90"/>
+            </w:tcMar>
+          </w:tcPr>
+          <w:p>
+            <w:r>
+              <w:rPr>
+                <w:rFonts w:ascii="Bai Jamjuree" w:cs="Bai Jamjuree" w:eastAsia="Bai Jamjuree" w:hAnsi="Bai Jamjuree"/>
+                <w:b w:val="false"/>
+                <w:bCs w:val="false"/>
+                <w:color w:val="000000"/>
+                <w:sz w:val="20"/>
+                <w:szCs w:val="20"/>
+              </w:rPr>
+              <w:t xml:space="preserve">Injury comes first. The injury alone is Medium, but the spill (hazardous, more than 1 L, on the floor) is High.</w:t>
+            </w:r>
+          </w:p>
+        </w:tc>
+      </w:tr>
     </w:tbl>
     <w:p>
       <w:pPr>
@@ -2185,7 +2297,7 @@
                 <w:sz w:val="20"/>
                 <w:szCs w:val="20"/>
               </w:rPr>
-              <w:t xml:space="preserve">Near miss</w:t>
+              <w:t xml:space="preserve">Equipment</w:t>
             </w:r>
           </w:p>
         </w:tc>
@@ -2215,7 +2327,7 @@
                 <w:sz w:val="20"/>
                 <w:szCs w:val="20"/>
               </w:rPr>
-              <w:t xml:space="preserve">Low</w:t>
+              <w:t xml:space="preserve">High</w:t>
             </w:r>
           </w:p>
         </w:tc>
@@ -2470,7 +2582,7 @@
                 <w:sz w:val="20"/>
                 <w:szCs w:val="20"/>
               </w:rPr>
-              <w:t xml:space="preserve">Equipment</w:t>
+              <w:t xml:space="preserve">Fire</w:t>
             </w:r>
           </w:p>
         </w:tc>
@@ -2500,7 +2612,7 @@
                 <w:sz w:val="20"/>
                 <w:szCs w:val="20"/>
               </w:rPr>
-              <w:t xml:space="preserve">Medium</w:t>
+              <w:t xml:space="preserve">High</w:t>
             </w:r>
           </w:p>
         </w:tc>
@@ -2570,7 +2682,7 @@
           <w:sz w:val="20"/>
           <w:szCs w:val="20"/>
         </w:rPr>
-        <w:t xml:space="preserve">2,Near miss,Low</w:t>
+        <w:t xml:space="preserve">2,Equipment,High</w:t>
       </w:r>
     </w:p>
     <w:p>
@@ -2609,7 +2721,7 @@
           <w:sz w:val="20"/>
           <w:szCs w:val="20"/>
         </w:rPr>
-        <w:t xml:space="preserve">300,Equipment,Medium</w:t>
+        <w:t xml:space="preserve">300,Fire,High</w:t>
       </w:r>
     </w:p>
     <w:p>
@@ -2649,7 +2761,7 @@
         </w:rPr>
         <w:t xml:space="preserve">Open </w:t>
       </w:r>
-      <w:hyperlink w:history="1" r:id="rIdxhnb5k69ui76kzkx8js-z">
+      <w:hyperlink w:history="1" r:id="rIdhhc0rc31jjjedvlo2njc3">
         <w:r>
           <w:rPr>
             <w:rFonts w:ascii="Bai Jamjuree" w:cs="Bai Jamjuree" w:eastAsia="Bai Jamjuree" w:hAnsi="Bai Jamjuree"/>

</xml_diff>